<commit_message>
docs: reflect pluggable engine architecture in reference card + exaserve.md
Surgical updates to the architecture description now that engines are pluggable
(single EngineWorker host over an EngineBackend: vLLM/SGLang via EXASERVE_ENGINE;
proxy likewise pluggable). Only the affected intro/description/engine-knob text
changed — scaling numbers, recipes, and the PBS/XPU/Aurora specifics are left as
is (scheduler/vendor genericity is not built yet, only sketched).

- doc/exaserve.md: frontmatter description, intro paragraph, EXASERVE_ENGINE knob.
- tools/make_refcard_docx.py: matching intro + engine-row text.
- doc/ExaServe_Reference_Card.docx: patched in-place (template unavailable to
  regenerate) with the same two spans; styling preserved.
</commit_message>
<xml_diff>
--- a/doc/ExaServe_Reference_Card.docx
+++ b/doc/ExaServe_Reference_Card.docx
@@ -49,7 +49,7 @@
         <w:spacing w:after="100"/>
       </w:pPr>
       <w:r>
-        <w:t xml:space="preserve">ExaServe is a framework for scaling LLM inference across the compute nodes of an HPC system. From one YAML file and one command, it turns a PBS allocation into a single OpenAI-compatible inference service: it launches a Ray cluster over the allocation, stages model weights to node-local storage with an MPI broadcast, deploys one vLLM (or SGLang) replica per GPU tile as Ray Serve applications, and optionally fronts them with a head-node proxy such as HAProxy. A companion benchmarking harness measures deployments end to end and has validated them at up to 256 nodes (3,072 Intel XPU tiles) on ALCF Aurora.</w:t>
+        <w:t>ExaServe is a framework for scaling LLM inference across the compute nodes of an HPC system. From one YAML file and one command, it turns a PBS allocation into a single OpenAI-compatible inference service: it launches a Ray cluster over the allocation, stages model weights to node-local storage with an MPI broadcast, deploys one inference replica per GPU tile as Ray Serve applications — a single EngineWorker host over a pluggable engine backend (vLLM or SGLang, via EXASERVE_ENGINE) — and optionally fronts them with a pluggable head-node proxy such as HAProxy. A companion benchmarking harness measures deployments end to end and has validated them at up to 256 nodes (3,072 Intel XPU tiles) on ALCF Aurora.</w:t>
       </w:r>
     </w:p>
     <w:p>
@@ -2911,7 +2911,7 @@
                 <w:sz w:val="19"/>
                 <w:szCs w:val="19"/>
               </w:rPr>
-              <w:t xml:space="preserve">SGLang instead of vLLM as the inference engine</w:t>
+              <w:t>Select the SGLang engine backend instead of the default vLLM (both plug into the same EngineWorker host)</w:t>
             </w:r>
           </w:p>
         </w:tc>

</xml_diff>

<commit_message>
docs: lowercase the github repo URL (wenyiwang-us/exaserve) + clone dir
The GitHub repo was renamed to lowercase `exaserve`. Update the repo references
in both reference-card sources and regenerate the docx:
- wenyiwang-us/ExaServe -> wenyiwang-us/exaserve (all URLs)
- `git clone ... && cd ExaServe` -> `cd exaserve` (clone dir follows repo name)
Brand prose "ExaServe" (the product display name, distinct from the `exaserve`
package/repo) is left capitalized.
</commit_message>
<xml_diff>
--- a/doc/ExaServe_Reference_Card.docx
+++ b/doc/ExaServe_Reference_Card.docx
@@ -41,7 +41,7 @@
           <w:sz w:val="19"/>
           <w:szCs w:val="19"/>
         </w:rPr>
-        <w:t xml:space="preserve">Scaling LLM Inference on HPC  —  One OpenAI-Compatible Endpoint from N Compute Nodes  •  github.com/wenyiwang-us/ExaServe</w:t>
+        <w:t xml:space="preserve">Scaling LLM Inference on HPC  —  One OpenAI-Compatible Endpoint from N Compute Nodes  •  github.com/wenyiwang-us/exaserve</w:t>
       </w:r>
     </w:p>
     <w:p>
@@ -705,7 +705,7 @@
                 <w:sz w:val="16"/>
                 <w:szCs w:val="16"/>
               </w:rPr>
-              <w:t xml:space="preserve">git clone https://github.com/wenyiwang-us/ExaServe &amp;&amp; cd ExaServe</w:t>
+              <w:t xml:space="preserve">git clone https://github.com/wenyiwang-us/exaserve &amp;&amp; cd exaserve</w:t>
             </w:r>
             <w:r>
               <w:br/>
@@ -3283,7 +3283,7 @@
         <w:spacing w:after="80"/>
       </w:pPr>
       <w:r>
-        <w:t xml:space="preserve">Runnable configurations and benchmark specifications live in the repository; code is linked rather than copied here. Paths are relative to github.com/wenyiwang-us/ExaServe.</w:t>
+        <w:t xml:space="preserve">Runnable configurations and benchmark specifications live in the repository; code is linked rather than copied here. Paths are relative to github.com/wenyiwang-us/exaserve.</w:t>
       </w:r>
     </w:p>
     <w:tbl>
@@ -3421,7 +3421,7 @@
                 <w:sz w:val="19"/>
                 <w:szCs w:val="19"/>
               </w:rPr>
-              <w:t xml:space="preserve">github.com/wenyiwang-us/ExaServe</w:t>
+              <w:t xml:space="preserve">github.com/wenyiwang-us/exaserve</w:t>
             </w:r>
           </w:p>
         </w:tc>

</xml_diff>

<commit_message>
docs: generic scheduler framing + honest scheduler/vendor limitations
Reframe the top-line pitch so the scheduler reads as generic while naming PBS as
today's example, and add a Limitations section stating the real portability state:
- "turns a PBS allocation" -> "turns a batch-scheduler allocation (e.g. a PBS job)"
  in exaserve.md intro/description and the docx intro + why-row.
- New Limitations section (md) + Portability callout (docx): the engine and proxy
  are pluggable, but the batch scheduler is PBS-only today ($PBS_NODEFILE +
  mpiexec/PALS); a SchedulerBackend interface is DESIGNED
  (doc/design/scheduler_abstraction.md) but not yet implemented — another
  scheduler currently means writing that backend (e.g. srun); Slurm is the planned
  first addition. Accelerator is Intel-XPU-only today (NVIDIA/AMD abstraction
  designed, not built).

Kept accurate: does not claim a finished scheduler interface (only engine/proxy
are actually pluggable in code).
</commit_message>
<xml_diff>
--- a/doc/ExaServe_Reference_Card.docx
+++ b/doc/ExaServe_Reference_Card.docx
@@ -49,7 +49,7 @@
         <w:spacing w:after="100"/>
       </w:pPr>
       <w:r>
-        <w:t xml:space="preserve">ExaServe is a framework for scaling LLM inference across the compute nodes of an HPC system. From one YAML file and one command, it turns a PBS allocation into a single OpenAI-compatible inference service: it launches a Ray cluster over the allocation, stages model weights to node-local storage with an MPI broadcast, deploys one inference replica per GPU tile as Ray Serve applications — a single EngineWorker host over a pluggable engine backend (vLLM or SGLang, via EXASERVE_ENGINE) — and optionally fronts them with a pluggable head-node proxy such as HAProxy. A companion benchmarking harness measures deployments end to end and has validated them at up to 256 nodes (3,072 Intel XPU tiles) on ALCF Aurora.</w:t>
+        <w:t xml:space="preserve">ExaServe is a framework for scaling LLM inference across the compute nodes of an HPC system. From one YAML file and one command, it turns a batch-scheduler allocation (e.g. a PBS job) into a single OpenAI-compatible inference service: it launches a Ray cluster over the allocation, stages model weights to node-local storage with an MPI broadcast, deploys one inference replica per GPU tile as Ray Serve applications — a single EngineWorker host over a pluggable engine backend (vLLM or SGLang, via EXASERVE_ENGINE) — and optionally fronts them with a pluggable head-node proxy such as HAProxy. A companion benchmarking harness measures deployments end to end and has validated them at up to 256 nodes (3,072 Intel XPU tiles) on ALCF Aurora.</w:t>
       </w:r>
     </w:p>
     <w:p>
@@ -95,7 +95,7 @@
         <w:spacing w:after="80"/>
       </w:pPr>
       <w:r>
-        <w:t xml:space="preserve">One YAML file plus one command turns a PBS allocation into an OpenAI-compatible service; clients see the standard API and need no HPC knowledge.</w:t>
+        <w:t xml:space="preserve">One YAML file plus one command turns a batch-scheduler allocation (e.g. a PBS job) into an OpenAI-compatible service; clients see the standard API and need no HPC knowledge.</w:t>
       </w:r>
     </w:p>
     <w:p>
@@ -3162,6 +3162,59 @@
         <w:t xml:space="preserve">Scale cliffs and their fixes (Ray/vLLM patches at 256+ nodes, thread-pool clamps) are catalogued in doc/KNOWN_ISSUES.md; the launcher applies the fixes automatically.</w:t>
       </w:r>
     </w:p>
+    <w:tbl>
+      <w:tblPr>
+        <w:tblW w:type="dxa" w:w="10224"/>
+        <w:tblBorders>
+          <w:top w:val="none" w:color="auto" w:sz="0"/>
+          <w:left w:val="none" w:color="auto" w:sz="0"/>
+          <w:bottom w:val="none" w:color="auto" w:sz="0"/>
+          <w:right w:val="none" w:color="auto" w:sz="0"/>
+          <w:insideH w:val="none" w:color="auto" w:sz="0"/>
+          <w:insideV w:val="none" w:color="auto" w:sz="0"/>
+        </w:tblBorders>
+      </w:tblPr>
+      <w:tblGrid>
+        <w:gridCol w:w="10224"/>
+      </w:tblGrid>
+      <w:tr>
+        <w:trPr>
+          <w:cantSplit/>
+        </w:trPr>
+        <w:tc>
+          <w:tcPr>
+            <w:tcW w:type="dxa" w:w="10224"/>
+            <w:tcBorders>
+              <w:top w:val="single" w:color="C2613F" w:sz="4"/>
+              <w:left w:val="single" w:color="C2613F" w:sz="20"/>
+              <w:bottom w:val="single" w:color="C2613F" w:sz="4"/>
+              <w:right w:val="single" w:color="C2613F" w:sz="4"/>
+            </w:tcBorders>
+            <w:shd w:fill="FCF3E2" w:color="auto" w:val="clear"/>
+            <w:tcMar>
+              <w:top w:type="dxa" w:w="110"/>
+              <w:left w:type="dxa" w:w="170"/>
+              <w:bottom w:type="dxa" w:w="110"/>
+              <w:right w:type="dxa" w:w="150"/>
+            </w:tcMar>
+          </w:tcPr>
+          <w:p>
+            <w:r>
+              <w:rPr>
+                <w:b/>
+                <w:bCs/>
+                <w:color w:val="9C4A2E"/>
+              </w:rPr>
+              <w:t xml:space="preserve">Portability.  </w:t>
+            </w:r>
+            <w:r>
+              <w:t xml:space="preserve">The inference engine and front-end proxy are pluggable (EXASERVE_ENGINE / proxy_config.type), but the batch scheduler is PBS-only today: the launcher reads $PBS_NODEFILE and stages over mpiexec/PALS. A SchedulerBackend interface is designed (doc/design/scheduler_abstraction.md) but not yet implemented — another scheduler currently means writing that backend (e.g. srun instead of mpiexec). Slurm is the planned first addition. Accelerator support is likewise Intel-XPU-only today, with a NVIDIA/AMD vendor abstraction designed but not built.</w:t>
+            </w:r>
+          </w:p>
+        </w:tc>
+      </w:tr>
+    </w:tbl>
+    <w:p/>
     <w:p>
       <w:pPr>
         <w:pBdr>

</xml_diff>

<commit_message>
docs: resolve reference-card review comments (generic scheduler, QPS, Aurora subsections)
Address the # WW: review notes in make_refcard_docx.py and mirror the consistency
changes into exaserve.md:
- Drop the env-var name from the intro (no "via EXASERVE_ENGINE" in the pitch).
- Genericize scheduler framing in overview/why/component text: "PBS scheduling"
  -> "batch-queue scheduling", "PBS jobs" -> "scheduler jobs", "on a PBS
  allocation" -> "on a scheduler allocation", "Budget PBS walltime" -> "job
  walltime"; drop the redundant "(e.g. a PBS job)" where already stated. Concrete
  Aurora examples (qsub/PBS job ids) stay — they are Aurora-specific.
- Unify throughput units to QPS (requests/s, query/s, req/s -> QPS) to match the
  figures.
- Scope Aurora-specific content into "On ALCF Aurora" subsections (Installation,
  Example) with a note that other sites come later; add an Aurora-scope overview
  to the Scaling section.
- Regenerated the docx.
</commit_message>
<xml_diff>
--- a/doc/ExaServe_Reference_Card.docx
+++ b/doc/ExaServe_Reference_Card.docx
@@ -49,7 +49,7 @@
         <w:spacing w:after="100"/>
       </w:pPr>
       <w:r>
-        <w:t xml:space="preserve">ExaServe is a framework for scaling LLM inference across the compute nodes of an HPC system. From one YAML file and one command, it turns a batch-scheduler allocation (e.g. a PBS job) into a single OpenAI-compatible inference service: it launches a Ray cluster over the allocation, stages model weights to node-local storage with an MPI broadcast, deploys one inference replica per GPU tile as Ray Serve applications — a single EngineWorker host over a pluggable engine backend (vLLM or SGLang, via EXASERVE_ENGINE) — and optionally fronts them with a pluggable head-node proxy such as HAProxy. A companion benchmarking harness measures deployments end to end and has validated them at up to 256 nodes (3,072 Intel XPU tiles) on ALCF Aurora.</w:t>
+        <w:t xml:space="preserve">ExaServe is a framework for scaling LLM inference across the compute nodes of an HPC system. From one YAML file and one command, it turns a batch-scheduler allocation (e.g. a PBS job) into a single OpenAI-compatible inference service: it launches a Ray cluster over the allocation, stages model weights to node-local storage with an MPI broadcast, deploys one inference replica per GPU tile as Ray Serve applications — a single EngineWorker host over a pluggable engine backend (vLLM or SGLang) — and optionally fronts them with a pluggable head-node proxy such as HAProxy. A companion benchmarking harness measures deployments end to end and has validated them at up to 256 nodes (3,072 Intel XPU tiles) on ALCF Aurora.</w:t>
       </w:r>
     </w:p>
     <w:p>
@@ -75,7 +75,7 @@
         <w:spacing w:after="80"/>
       </w:pPr>
       <w:r>
-        <w:t xml:space="preserve">Existing LLM serving stacks assume cloud environments; HPC systems bring PBS scheduling, MPI-only launch paths, Lustre metadata costs, exotic accelerators, and scale cliffs that only appear past a hundred nodes. ExaServe packages the engineering needed to cross that gap:</w:t>
+        <w:t xml:space="preserve">Existing LLM serving stacks assume cloud environments; HPC systems bring batch-queue scheduling, MPI-only launch paths, Lustre metadata costs, exotic accelerators, and scale cliffs that only appear past a hundred nodes. ExaServe packages the engineering needed to cross that gap:</w:t>
       </w:r>
     </w:p>
     <w:p>
@@ -95,7 +95,7 @@
         <w:spacing w:after="80"/>
       </w:pPr>
       <w:r>
-        <w:t xml:space="preserve">One YAML file plus one command turns a batch-scheduler allocation (e.g. a PBS job) into an OpenAI-compatible service; clients see the standard API and need no HPC knowledge.</w:t>
+        <w:t xml:space="preserve">One YAML file plus one command turns a batch-scheduler allocation into an OpenAI-compatible service; clients see the standard API and need no HPC knowledge.</w:t>
       </w:r>
     </w:p>
     <w:p>
@@ -115,7 +115,7 @@
         <w:spacing w:after="80"/>
       </w:pPr>
       <w:r>
-        <w:t xml:space="preserve">Deployments measured to 256 nodes / 3,072 replicas behind a production HAProxy front end: 27.1k non-streaming requests/s with Llama-3-8B (one replica per tile) — 96% weak-scaling efficiency at 256 nodes (27.1k of 28.2k offered, 0% errors). A quantified comparison of head-node proxies (HAProxy, Envoy, LiteLLM, Ray Serve proxy) guides the front-end choice.</w:t>
+        <w:t xml:space="preserve">Deployments measured to 256 nodes / 3,072 replicas behind a production HAProxy front end: 27.1k non-streaming QPS with Llama-3-8B (one replica per tile) — 96% weak-scaling efficiency at 256 nodes (27.1k of 28.2k offered, 0% errors). A quantified comparison of head-node proxies (HAProxy, Envoy, LiteLLM, Ray Serve proxy) guides the front-end choice.</w:t>
       </w:r>
     </w:p>
     <w:p>
@@ -155,7 +155,7 @@
         <w:spacing w:after="80"/>
       </w:pPr>
       <w:r>
-        <w:t xml:space="preserve">A declarative benchmark harness generates traces and PBS jobs, replays load through a Go client, and scores per-request TTFT/TBT against latency SLOs.</w:t>
+        <w:t xml:space="preserve">A declarative benchmark harness generates traces and scheduler jobs, replays load through a Go client, and scores per-request TTFT/TBT against latency SLOs.</w:t>
       </w:r>
     </w:p>
     <w:p>
@@ -320,7 +320,7 @@
                 <w:sz w:val="19"/>
                 <w:szCs w:val="19"/>
               </w:rPr>
-              <w:t xml:space="preserve">exaserve-serve-submit (batch, from a login node) or exaserve-launch-cluster (interactive) bring up the whole stack on a PBS allocation</w:t>
+              <w:t xml:space="preserve">exaserve-serve-submit (batch, from a login node) or exaserve-launch-cluster (interactive) bring up the whole stack on a scheduler allocation</w:t>
             </w:r>
           </w:p>
         </w:tc>
@@ -615,7 +615,7 @@
                 <w:sz w:val="19"/>
                 <w:szCs w:val="19"/>
               </w:rPr>
-              <w:t xml:space="preserve">eval/: declarative specs → traces + PBS jobs → replay → SLO scoring</w:t>
+              <w:t xml:space="preserve">eval/: declarative specs → traces + scheduler jobs → replay → SLO scoring</w:t>
             </w:r>
           </w:p>
         </w:tc>
@@ -638,6 +638,26 @@
           <w:szCs w:val="26"/>
         </w:rPr>
         <w:t xml:space="preserve">3  ·  Installation</w:t>
+      </w:r>
+    </w:p>
+    <w:p>
+      <w:pPr>
+        <w:spacing w:after="60"/>
+      </w:pPr>
+      <w:r>
+        <w:t xml:space="preserve">Install steps are site-specific — they depend on how the host provides Ray, the inference engine, MPI, and the accelerator toolchain. The recipe below targets ALCF Aurora; recipes for other sites will be added as they are supported.</w:t>
+      </w:r>
+    </w:p>
+    <w:p>
+      <w:pPr>
+        <w:spacing w:after="60"/>
+      </w:pPr>
+      <w:r>
+        <w:rPr>
+          <w:b/>
+          <w:bCs/>
+        </w:rPr>
+        <w:t xml:space="preserve">On ALCF Aurora</w:t>
       </w:r>
     </w:p>
     <w:p>
@@ -791,6 +811,18 @@
           <w:szCs w:val="26"/>
         </w:rPr>
         <w:t xml:space="preserve">4  ·  Example</w:t>
+      </w:r>
+    </w:p>
+    <w:p>
+      <w:pPr>
+        <w:spacing w:after="60"/>
+      </w:pPr>
+      <w:r>
+        <w:rPr>
+          <w:b/>
+          <w:bCs/>
+        </w:rPr>
+        <w:t xml:space="preserve">On ALCF Aurora</w:t>
       </w:r>
     </w:p>
     <w:p>
@@ -1340,6 +1372,14 @@
     </w:p>
     <w:p>
       <w:pPr>
+        <w:spacing w:after="80"/>
+      </w:pPr>
+      <w:r>
+        <w:t xml:space="preserve">All measurements in this section were conducted on ALCF Aurora (Intel PVC XPU, 12 tiles/node, PBS), at up to 256 nodes / 3,072 tiles.</w:t>
+      </w:r>
+    </w:p>
+    <w:p>
+      <w:pPr>
         <w:spacing w:after="60"/>
       </w:pPr>
       <w:r>
@@ -1355,7 +1395,7 @@
         <w:spacing w:after="60"/>
       </w:pPr>
       <w:r>
-        <w:t xml:space="preserve">All client traffic enters through the head-node proxy. Non-streaming completions scale nearly linearly through a single HAProxy — 27.1k requests/s with Llama-3-8B at 256 nodes / 3,072 single-tile replicas, 0% errors. Streaming (SSE) is harder on a centralized front end: the per-token delivery path saturates the head node’s network at large node counts, so requests still complete but slowly — streaming throughput plateaus around 4.7k requests/s from 128 nodes, and p99 end-to-end latency reaches 17 s at 256 nodes while non-streaming p99 stays near 2 s at every scale. Budget streaming capacity per proxy and prefer non-streaming completions at extreme scale.</w:t>
+        <w:t xml:space="preserve">All client traffic enters through the head-node proxy. Non-streaming completions scale nearly linearly through a single HAProxy — 27.1k QPS with Llama-3-8B at 256 nodes / 3,072 single-tile replicas, 0% errors. Streaming (SSE) is harder on a centralized front end: the per-token delivery path saturates the head node’s network at large node counts, so requests still complete but slowly — streaming throughput plateaus around 4.7k QPS from 128 nodes, and p99 end-to-end latency reaches 17 s at 256 nodes while non-streaming p99 stays near 2 s at every scale. Budget streaming capacity per proxy and prefer non-streaming completions at extreme scale.</w:t>
       </w:r>
     </w:p>
     <w:p>
@@ -1483,7 +1523,7 @@
         <w:spacing w:after="60"/>
       </w:pPr>
       <w:r>
-        <w:t xml:space="preserve">Models larger than a node are served with pipeline parallelism across node pairs (Llama-3.1-405B: TP8 within a node × PP2 across two nodes). Shard-aware staging gives each pipeline stage only its own weight shard (~380 GiB, which fits node-local tmpfs) and pins each replica to its nodes. All 405B measurements are streaming: at a fixed per-replica offered rate, aggregate successful throughput grows from 0.7 query/s at 2 replicas to 31.0 query/s at 128 replicas (4 to 256 nodes) — 67% weak-scaling efficiency vs the 4-node base, sublinear rather than linear. Through a single HAProxy the service tracks the proxy-bypass diagnostic up to 64 nodes (9.3 query/s, 80%) before the same head-node streaming ceiling appears; a non-streaming 405B configuration has not been measured.</w:t>
+        <w:t xml:space="preserve">Models larger than a node are served with pipeline parallelism across node pairs (Llama-3.1-405B: TP8 within a node × PP2 across two nodes). Shard-aware staging gives each pipeline stage only its own weight shard (~380 GiB, which fits node-local tmpfs) and pins each replica to its nodes. All 405B measurements are streaming: at a fixed per-replica offered rate, aggregate successful throughput grows from 0.7 QPS at 2 replicas to 31.0 QPS at 128 replicas (4 to 256 nodes) — 67% weak-scaling efficiency vs the 4-node base, sublinear rather than linear. Through a single HAProxy the service tracks the proxy-bypass diagnostic up to 64 nodes (9.3 QPS, 80%) before the same head-node streaming ceiling appears; a non-streaming 405B configuration has not been measured.</w:t>
       </w:r>
     </w:p>
     <w:p>
@@ -2753,7 +2793,7 @@
         <w:spacing w:after="80"/>
       </w:pPr>
       <w:r>
-        <w:t xml:space="preserve">Everything above is steady-state serving, measured after the cluster reports ready. Cluster bring-up behaves differently: it does not scale, and this is Ray’s key limitation at HPC scale. Model staging (~50 s for the 8B model), Ray cluster start (~45 s), and first-request warm-up (~8 s) are roughly flat in node count, but Ray Serve’s serve.run phase grows superlinearly — 171 s at 64 nodes, 470 s at 128, and 1,857 s (~31 min) at 256 — and a 512-node bring-up fails outright. The growth is concentrated in the proxy readiness wait: on every deployment broadcast, every Ray Serve proxy resolves every replica handle against the Ray control store (GCS), work that is quadratic in node count and reaches 1.38 million GCS lookups at 256 nodes. Budget PBS walltime as bring-up plus serving window (405B weight loading adds more), and reuse a running cluster across experiments where possible.</w:t>
+        <w:t xml:space="preserve">Everything above is steady-state serving, measured after the cluster reports ready. Cluster bring-up behaves differently: it does not scale, and this is Ray’s key limitation at HPC scale. Model staging (~50 s for the 8B model), Ray cluster start (~45 s), and first-request warm-up (~8 s) are roughly flat in node count, but Ray Serve’s serve.run phase grows superlinearly — 171 s at 64 nodes, 470 s at 128, and 1,857 s (~31 min) at 256 — and a 512-node bring-up fails outright. The growth is concentrated in the proxy readiness wait: on every deployment broadcast, every Ray Serve proxy resolves every replica handle against the Ray control store (GCS), work that is quadratic in node count and reaches 1.38 million GCS lookups at 256 nodes. Budget job walltime as bring-up plus serving window (405B weight loading adds more), and reuse a running cluster across experiments where possible.</w:t>
       </w:r>
     </w:p>
     <w:p>

</xml_diff>

<commit_message>
docs: proofread pass — align exaserve.md with the reference-card docx
Your edit (subsection heading "On ALCF Aurora" -> "ALCF Aurora") applied to both
Install and Example; regenerated the docx. Fixed inconsistencies where the docx
had been updated but exaserve.md had not:
- Intro: drop "selected by EXASERVE_ENGINE" (env var stays in the knobs table).
- "budget PBS walltime" -> "budget job walltime".
- Install: add the site-specific framing note ("recipe below targets ALCF Aurora").
Cross-checked: no env var in either intro, no "PBS walltime", rate units all QPS,
no leftover # WW: comments, knobs tables retained.
</commit_message>
<xml_diff>
--- a/doc/ExaServe_Reference_Card.docx
+++ b/doc/ExaServe_Reference_Card.docx
@@ -657,7 +657,7 @@
           <w:b/>
           <w:bCs/>
         </w:rPr>
-        <w:t xml:space="preserve">On ALCF Aurora</w:t>
+        <w:t xml:space="preserve">ALCF Aurora</w:t>
       </w:r>
     </w:p>
     <w:p>
@@ -822,7 +822,7 @@
           <w:b/>
           <w:bCs/>
         </w:rPr>
-        <w:t xml:space="preserve">On ALCF Aurora</w:t>
+        <w:t xml:space="preserve">ALCF Aurora</w:t>
       </w:r>
     </w:p>
     <w:p>

</xml_diff>

<commit_message>
Complete ExaServe production hardening
</commit_message>
<xml_diff>
--- a/doc/ExaServe_Reference_Card.docx
+++ b/doc/ExaServe_Reference_Card.docx
@@ -49,7 +49,7 @@
         <w:spacing w:after="100"/>
       </w:pPr>
       <w:r>
-        <w:t xml:space="preserve">ExaServe is a framework for scaling LLM inference across the compute nodes of an HPC system. From one YAML file and one command, it turns a batch-scheduler allocation (e.g. a PBS job) into a single OpenAI-compatible inference service: it launches a Ray cluster over the allocation, stages model weights to node-local storage with an MPI broadcast, deploys one inference replica per GPU tile as Ray Serve applications — a single EngineWorker host over a pluggable engine backend (vLLM or SGLang) — and optionally fronts them with a pluggable head-node proxy such as HAProxy. A companion benchmarking harness measures deployments end to end and has validated them at up to 256 nodes (3,072 Intel XPU tiles) on ALCF Aurora.</w:t>
+        <w:t xml:space="preserve">ExaServe is a framework for scaling LLM inference across the compute nodes of an HPC system. From one YAML file and one command, it turns a batch-scheduler allocation (e.g. a PBS job) into a single OpenAI-compatible inference service: it launches a Ray cluster over the allocation, stages model weights to node-local storage with an MPI broadcast, deploys vLLM inference replicas as separate Ray Serve applications, and fronts them with one head-owned HAProxy. A companion evaluation harness measures deployments end to end. The current evidence-backed production maximum is two Aurora nodes; larger historical measurements below predate the hardened architecture and are research context, not a current support or qualification claim.</w:t>
       </w:r>
     </w:p>
     <w:p>
@@ -107,7 +107,7 @@
           <w:b/>
           <w:bCs/>
         </w:rPr>
-        <w:t xml:space="preserve">Validated at scale</w:t>
+        <w:t xml:space="preserve">Historical scale evidence</w:t>
       </w:r>
     </w:p>
     <w:p>
@@ -115,7 +115,7 @@
         <w:spacing w:after="80"/>
       </w:pPr>
       <w:r>
-        <w:t xml:space="preserve">Deployments measured to 256 nodes / 3,072 replicas behind a production HAProxy front end: 27.1k non-streaming QPS with Llama-3-8B (one replica per tile) — 96% weak-scaling efficiency at 256 nodes (27.1k of 28.2k offered, 0% errors). A quantified comparison of head-node proxies (HAProxy, Envoy, LiteLLM, Ray Serve proxy) guides the front-end choice.</w:t>
+        <w:t xml:space="preserve">Earlier deployments measured to 256 nodes / 3,072 replicas behind HAProxy front end: 27.1k non-streaming QPS with Llama-3-8B (one replica per tile) — 96% weak-scaling efficiency at 256 nodes (27.1k of 28.2k offered, 0% errors). A quantified comparison of head-node proxies (HAProxy, Envoy, LiteLLM, Ray Serve proxy) guides qualification work, but those runs do not qualify the hardened path.</w:t>
       </w:r>
     </w:p>
     <w:p>
@@ -127,7 +127,7 @@
           <w:b/>
           <w:bCs/>
         </w:rPr>
-        <w:t xml:space="preserve">Frontier-model ready</w:t>
+        <w:t xml:space="preserve">Frontier-model research</w:t>
       </w:r>
     </w:p>
     <w:p>
@@ -135,7 +135,7 @@
         <w:spacing w:after="80"/>
       </w:pPr>
       <w:r>
-        <w:t xml:space="preserve">Multi-node pipeline parallelism serves Llama-3.1-405B (TP8 × PP2, two nodes per replica) with shard-aware weight staging, demonstrated from 2 to 128 replicas (4 to 256 nodes) at 67% weak-scaling efficiency (streaming).</w:t>
+        <w:t xml:space="preserve">Multi-node pipeline parallelism serves Llama-3.1-405B (TP8 × PP2, two nodes per replica) with shard-aware weight staging, demonstrated from 2 to 128 replicas (4 to 256 nodes) at 67% weak-scaling efficiency (streaming) on the historical path.</w:t>
       </w:r>
     </w:p>
     <w:p>
@@ -438,7 +438,7 @@
                 <w:sz w:val="19"/>
                 <w:szCs w:val="19"/>
               </w:rPr>
-              <w:t xml:space="preserve">vLLM or SGLang replicas as independent Ray Serve applications — one per GPU tile (12 per Aurora node) for single-tile models, or spanning multiple tiles and nodes via tensor/pipeline parallelism for larger models</w:t>
+              <w:t xml:space="preserve">vLLM replicas as independent Ray Serve applications — one per GPU tile (12 per Aurora node) for single-tile models, or spanning multiple tiles and nodes via tensor/pipeline parallelism for larger models</w:t>
             </w:r>
           </w:p>
         </w:tc>
@@ -497,7 +497,7 @@
                 <w:sz w:val="19"/>
                 <w:szCs w:val="19"/>
               </w:rPr>
-              <w:t xml:space="preserve">HAProxy, LiteLLM, and others — a single client-facing endpoint with load balancing, plus auth and rate limits with LiteLLM</w:t>
+              <w:t xml:space="preserve">One head-owned HAProxy — the sole current production gateway — exposes a single allocation-internal endpoint</w:t>
             </w:r>
           </w:p>
         </w:tc>
@@ -529,7 +529,7 @@
                 <w:sz w:val="19"/>
                 <w:szCs w:val="19"/>
               </w:rPr>
-              <w:t xml:space="preserve">Site patches</w:t>
+              <w:t xml:space="preserve">Compatibility profile</w:t>
             </w:r>
           </w:p>
         </w:tc>
@@ -556,7 +556,7 @@
                 <w:sz w:val="19"/>
                 <w:szCs w:val="19"/>
               </w:rPr>
-              <w:t xml:space="preserve">Small Ray/vLLM fixes required at 256+ nodes, applied automatically at launch</w:t>
+              <w:t xml:space="preserve">Version-pinned targeted activation plus per-process attestation before READY</w:t>
             </w:r>
           </w:p>
         </w:tc>
@@ -792,7 +792,7 @@
         <w:spacing w:after="80"/>
       </w:pPr>
       <w:r>
-        <w:t xml:space="preserve">One-time extras, each needed only for the feature that uses it: build HAProxy with scripts/build_haproxy.sh (proxied deployments); create a separate LiteLLM venv (its dependencies conflict with Ray/vLLM); build the benchmark load generator with module load go &amp;&amp; bash eval/go_client/build.sh.</w:t>
+        <w:t xml:space="preserve">One-time extras: build HAProxy with scripts/build_haproxy.sh for the production gateway; build the evaluation load generator with module load go &amp;&amp; bash eval/go_client/build.sh.</w:t>
       </w:r>
     </w:p>
     <w:p>
@@ -830,7 +830,7 @@
         <w:spacing w:after="60"/>
       </w:pPr>
       <w:r>
-        <w:t xml:space="preserve">One YAML file describes a deployment — the Ray cluster, the model deployment, and the client-facing proxy. Submit it from a login node (no allocation needed), then query the printed URL from anywhere that can reach the head node:</w:t>
+        <w:t xml:space="preserve">One flat canonical YAML file describes deployment semantics. Submit it from a login node (no allocation needed), then query the printed URL from anywhere that can reach the head node:</w:t>
       </w:r>
     </w:p>
     <w:tbl>
@@ -1061,7 +1061,7 @@
                 <w:sz w:val="16"/>
                 <w:szCs w:val="16"/>
               </w:rPr>
-              <w:t xml:space="preserve">ray_cluster_config:</w:t>
+              <w:t xml:space="preserve">num_nodes: 2</w:t>
             </w:r>
             <w:r>
               <w:br/>
@@ -1072,7 +1072,7 @@
                 <w:sz w:val="16"/>
                 <w:szCs w:val="16"/>
               </w:rPr>
-              <w:t xml:space="preserve">  head_ip: ""              # filled in at runtime</w:t>
+              <w:t xml:space="preserve">ray_port: 6379</w:t>
             </w:r>
             <w:r>
               <w:br/>
@@ -1083,7 +1083,7 @@
                 <w:sz w:val="16"/>
                 <w:szCs w:val="16"/>
               </w:rPr>
-              <w:t xml:space="preserve">  port: 6379</w:t>
+              <w:t xml:space="preserve">node_cpus: 64</w:t>
             </w:r>
             <w:r>
               <w:br/>
@@ -1094,7 +1094,7 @@
                 <w:sz w:val="16"/>
                 <w:szCs w:val="16"/>
               </w:rPr>
-              <w:t xml:space="preserve">  node_cpus: 64</w:t>
+              <w:t xml:space="preserve">model_storage_path: /lus/flare/projects/&lt;PROJECT&gt;/&lt;user&gt;/models</w:t>
             </w:r>
             <w:r>
               <w:br/>
@@ -1105,7 +1105,7 @@
                 <w:sz w:val="16"/>
                 <w:szCs w:val="16"/>
               </w:rPr>
-              <w:t xml:space="preserve">model_deployment_config:</w:t>
+              <w:t xml:space="preserve">local_stage_path: /tmp/hf_home</w:t>
             </w:r>
             <w:r>
               <w:br/>
@@ -1116,7 +1116,7 @@
                 <w:sz w:val="16"/>
                 <w:szCs w:val="16"/>
               </w:rPr>
-              <w:t xml:space="preserve">  num_nodes: 2</w:t>
+              <w:t xml:space="preserve">num_gpus_per_node: 12</w:t>
             </w:r>
             <w:r>
               <w:br/>
@@ -1127,7 +1127,7 @@
                 <w:sz w:val="16"/>
                 <w:szCs w:val="16"/>
               </w:rPr>
-              <w:t xml:space="preserve">  model_storage_path: /lus/flare/projects/&lt;PROJECT&gt;/&lt;user&gt;/models</w:t>
+              <w:t xml:space="preserve">models:</w:t>
             </w:r>
             <w:r>
               <w:br/>
@@ -1138,7 +1138,7 @@
                 <w:sz w:val="16"/>
                 <w:szCs w:val="16"/>
               </w:rPr>
-              <w:t xml:space="preserve">  local_stage_path: /tmp/hf_home</w:t>
+              <w:t xml:space="preserve">  - model_id: meta-llama/Meta-Llama-3-8B-Instruct</w:t>
             </w:r>
             <w:r>
               <w:br/>
@@ -1149,7 +1149,7 @@
                 <w:sz w:val="16"/>
                 <w:szCs w:val="16"/>
               </w:rPr>
-              <w:t xml:space="preserve">  num_gpus_per_node: 12</w:t>
+              <w:t xml:space="preserve">    tensor_parallel_size: 1</w:t>
             </w:r>
             <w:r>
               <w:br/>
@@ -1160,7 +1160,7 @@
                 <w:sz w:val="16"/>
                 <w:szCs w:val="16"/>
               </w:rPr>
-              <w:t xml:space="preserve">  model_configs:</w:t>
+              <w:t xml:space="preserve">    pipeline_parallel_size: 1</w:t>
             </w:r>
             <w:r>
               <w:br/>
@@ -1171,7 +1171,7 @@
                 <w:sz w:val="16"/>
                 <w:szCs w:val="16"/>
               </w:rPr>
-              <w:t xml:space="preserve">    - model_id: meta-llama/Meta-Llama-3-8B-Instruct</w:t>
+              <w:t xml:space="preserve">    max_model_len: 4096</w:t>
             </w:r>
             <w:r>
               <w:br/>
@@ -1182,7 +1182,7 @@
                 <w:sz w:val="16"/>
                 <w:szCs w:val="16"/>
               </w:rPr>
-              <w:t xml:space="preserve">      tensor_parallel_size: 1</w:t>
+              <w:t xml:space="preserve">    size: 8</w:t>
             </w:r>
             <w:r>
               <w:br/>
@@ -1193,7 +1193,7 @@
                 <w:sz w:val="16"/>
                 <w:szCs w:val="16"/>
               </w:rPr>
-              <w:t xml:space="preserve">      pipeline_parallel_size: 1</w:t>
+              <w:t xml:space="preserve">gateway:</w:t>
             </w:r>
             <w:r>
               <w:br/>
@@ -1204,7 +1204,7 @@
                 <w:sz w:val="16"/>
                 <w:szCs w:val="16"/>
               </w:rPr>
-              <w:t xml:space="preserve">      max_model_len: 4096</w:t>
+              <w:t xml:space="preserve">  kind: haproxy</w:t>
             </w:r>
             <w:r>
               <w:br/>
@@ -1215,7 +1215,7 @@
                 <w:sz w:val="16"/>
                 <w:szCs w:val="16"/>
               </w:rPr>
-              <w:t xml:space="preserve">      size: 8                # billions of params; drives replica planning</w:t>
+              <w:t xml:space="preserve">  port: 4001</w:t>
             </w:r>
             <w:r>
               <w:br/>
@@ -1226,7 +1226,7 @@
                 <w:sz w:val="16"/>
                 <w:szCs w:val="16"/>
               </w:rPr>
-              <w:t xml:space="preserve">      gpu_memory_utilization: 0.90</w:t>
+              <w:t xml:space="preserve">  backend_port: 8000</w:t>
             </w:r>
             <w:r>
               <w:br/>
@@ -1237,62 +1237,7 @@
                 <w:sz w:val="16"/>
                 <w:szCs w:val="16"/>
               </w:rPr>
-              <w:t xml:space="preserve">      enforce_eager: true</w:t>
-            </w:r>
-            <w:r>
-              <w:br/>
-            </w:r>
-            <w:r>
-              <w:rPr>
-                <w:rFonts w:ascii="Consolas" w:hAnsi="Consolas" w:cs="Consolas"/>
-                <w:sz w:val="16"/>
-                <w:szCs w:val="16"/>
-              </w:rPr>
-              <w:t xml:space="preserve">      max_num_seqs: 64</w:t>
-            </w:r>
-            <w:r>
-              <w:br/>
-            </w:r>
-            <w:r>
-              <w:rPr>
-                <w:rFonts w:ascii="Consolas" w:hAnsi="Consolas" w:cs="Consolas"/>
-                <w:sz w:val="16"/>
-                <w:szCs w:val="16"/>
-              </w:rPr>
-              <w:t xml:space="preserve">proxy_config:</w:t>
-            </w:r>
-            <w:r>
-              <w:br/>
-            </w:r>
-            <w:r>
-              <w:rPr>
-                <w:rFonts w:ascii="Consolas" w:hAnsi="Consolas" w:cs="Consolas"/>
-                <w:sz w:val="16"/>
-                <w:szCs w:val="16"/>
-              </w:rPr>
-              <w:t xml:space="preserve">  type: haproxy              # haproxy | litellm | none</w:t>
-            </w:r>
-            <w:r>
-              <w:br/>
-            </w:r>
-            <w:r>
-              <w:rPr>
-                <w:rFonts w:ascii="Consolas" w:hAnsi="Consolas" w:cs="Consolas"/>
-                <w:sz w:val="16"/>
-                <w:szCs w:val="16"/>
-              </w:rPr>
-              <w:t xml:space="preserve">  port: 4001                 # client-facing port</w:t>
-            </w:r>
-            <w:r>
-              <w:br/>
-            </w:r>
-            <w:r>
-              <w:rPr>
-                <w:rFonts w:ascii="Consolas" w:hAnsi="Consolas" w:cs="Consolas"/>
-                <w:sz w:val="16"/>
-                <w:szCs w:val="16"/>
-              </w:rPr>
-              <w:t xml:space="preserve">  backend_port: 8000         # Ray Serve HTTP port on each node</w:t>
+              <w:t xml:space="preserve">  options: {balance: leastconn, maxconn: 8000}</w:t>
             </w:r>
           </w:p>
         </w:tc>
@@ -1367,7 +1312,7 @@
           <w:sz w:val="26"/>
           <w:szCs w:val="26"/>
         </w:rPr>
-        <w:t xml:space="preserve">5  ·  Scaling to hundreds of nodes</w:t>
+        <w:t xml:space="preserve">5  ·  Historical scale evidence (not current qualification)</w:t>
       </w:r>
     </w:p>
     <w:p>
@@ -1375,7 +1320,7 @@
         <w:spacing w:after="80"/>
       </w:pPr>
       <w:r>
-        <w:t xml:space="preserve">All measurements in this section were conducted on ALCF Aurora (Intel PVC XPU, 12 tiles/node, PBS), at up to 256 nodes / 3,072 tiles.</w:t>
+        <w:t xml:space="preserve">All measurements in this section were conducted on the pre-cutover ALCF Aurora path. They are regression context only. The hardened architecture must be re-run at each approved tier before any larger support claim is published.</w:t>
       </w:r>
     </w:p>
     <w:p>
@@ -2805,7 +2750,7 @@
           <w:b/>
           <w:bCs/>
         </w:rPr>
-        <w:t xml:space="preserve">Launch-time knobs</w:t>
+        <w:t xml:space="preserve">Plan-bound validation controls</w:t>
       </w:r>
     </w:p>
     <w:p>
@@ -2813,7 +2758,7 @@
         <w:spacing w:after="60"/>
       </w:pPr>
       <w:r>
-        <w:t xml:space="preserve">Environment variables read by the launcher select engines and staging behavior:</w:t>
+        <w:t xml:space="preserve">These controls are compiled into the immutable deployment plan; ambient environment variables do not select a different production topology:</w:t>
       </w:r>
     </w:p>
     <w:tbl>
@@ -2924,7 +2869,7 @@
                 <w:sz w:val="19"/>
                 <w:szCs w:val="19"/>
               </w:rPr>
-              <w:t xml:space="preserve">EXASERVE_ENGINE=sglang</w:t>
+              <w:t xml:space="preserve">engine: vllm</w:t>
             </w:r>
           </w:p>
         </w:tc>
@@ -2951,7 +2896,7 @@
                 <w:sz w:val="19"/>
                 <w:szCs w:val="19"/>
               </w:rPr>
-              <w:t xml:space="preserve">Select the SGLang engine backend instead of the default vLLM (both plug into the same EngineWorker host)</w:t>
+              <w:t xml:space="preserve">The Aurora production SiteProfile rejects unqualified engines such as SGLang</w:t>
             </w:r>
           </w:p>
         </w:tc>
@@ -2983,7 +2928,7 @@
                 <w:sz w:val="19"/>
                 <w:szCs w:val="19"/>
               </w:rPr>
-              <w:t xml:space="preserve">EXASERVE_PP_SHARD_AWARE=1</w:t>
+              <w:t xml:space="preserve">runtime.pp_shard_aware: true</w:t>
             </w:r>
           </w:p>
         </w:tc>
@@ -3042,7 +2987,7 @@
                 <w:sz w:val="19"/>
                 <w:szCs w:val="19"/>
               </w:rPr>
-              <w:t xml:space="preserve">EXASERVE_PP_UMBRELLA=1</w:t>
+              <w:t xml:space="preserve">runtime.null_compute: true</w:t>
             </w:r>
           </w:p>
         </w:tc>
@@ -3069,7 +3014,7 @@
                 <w:sz w:val="19"/>
                 <w:szCs w:val="19"/>
               </w:rPr>
-              <w:t xml:space="preserve">Single root-route ingress over the per-replica PP routes</w:t>
+              <w:t xml:space="preserve">Skip the engine and simulate latency — control-plane stress tests</w:t>
             </w:r>
           </w:p>
         </w:tc>
@@ -3101,7 +3046,7 @@
                 <w:sz w:val="19"/>
                 <w:szCs w:val="19"/>
               </w:rPr>
-              <w:t xml:space="preserve">EXASERVE_NULL_COMPUTE=1</w:t>
+              <w:t xml:space="preserve">runtime.clean_stage: true</w:t>
             </w:r>
           </w:p>
         </w:tc>
@@ -3128,66 +3073,7 @@
                 <w:sz w:val="19"/>
                 <w:szCs w:val="19"/>
               </w:rPr>
-              <w:t xml:space="preserve">Skip the engine and simulate latency — control-plane stress tests</w:t>
-            </w:r>
-          </w:p>
-        </w:tc>
-      </w:tr>
-      <w:tr>
-        <w:trPr>
-          <w:cantSplit/>
-        </w:trPr>
-        <w:tc>
-          <w:tcPr>
-            <w:tcW w:type="dxa" w:w="3300"/>
-            <w:tcBorders>
-              <w:top w:val="single" w:color="D9D4CC" w:sz="2"/>
-              <w:left w:val="single" w:color="D9D4CC" w:sz="2"/>
-              <w:bottom w:val="single" w:color="D9D4CC" w:sz="2"/>
-              <w:right w:val="single" w:color="D9D4CC" w:sz="2"/>
-            </w:tcBorders>
-            <w:shd w:fill="FFFFFF" w:color="auto" w:val="clear"/>
-            <w:tcMar>
-              <w:top w:type="dxa" w:w="70"/>
-              <w:left w:type="dxa" w:w="120"/>
-              <w:bottom w:type="dxa" w:w="70"/>
-              <w:right w:type="dxa" w:w="120"/>
-            </w:tcMar>
-          </w:tcPr>
-          <w:p>
-            <w:r>
-              <w:rPr>
-                <w:sz w:val="19"/>
-                <w:szCs w:val="19"/>
-              </w:rPr>
-              <w:t xml:space="preserve">EXASERVE_CLEAN_STAGE=1</w:t>
-            </w:r>
-          </w:p>
-        </w:tc>
-        <w:tc>
-          <w:tcPr>
-            <w:tcW w:type="dxa" w:w="6924"/>
-            <w:tcBorders>
-              <w:top w:val="single" w:color="D9D4CC" w:sz="2"/>
-              <w:left w:val="single" w:color="D9D4CC" w:sz="2"/>
-              <w:bottom w:val="single" w:color="D9D4CC" w:sz="2"/>
-              <w:right w:val="single" w:color="D9D4CC" w:sz="2"/>
-            </w:tcBorders>
-            <w:shd w:fill="FFFFFF" w:color="auto" w:val="clear"/>
-            <w:tcMar>
-              <w:top w:type="dxa" w:w="70"/>
-              <w:left w:type="dxa" w:w="120"/>
-              <w:bottom w:type="dxa" w:w="70"/>
-              <w:right w:type="dxa" w:w="120"/>
-            </w:tcMar>
-          </w:tcPr>
-          <w:p>
-            <w:r>
-              <w:rPr>
-                <w:sz w:val="19"/>
-                <w:szCs w:val="19"/>
-              </w:rPr>
-              <w:t xml:space="preserve">Wipe node-local staged weights first (cold-start timing)</w:t>
+              <w:t xml:space="preserve">Request a fresh staged-model validation run</w:t>
             </w:r>
           </w:p>
         </w:tc>
@@ -3199,7 +3085,7 @@
         <w:spacing w:after="80"/>
       </w:pPr>
       <w:r>
-        <w:t xml:space="preserve">Scale cliffs and their fixes (Ray/vLLM patches at 256+ nodes, thread-pool clamps) are catalogued in doc/KNOWN_ISSUES.md; the launcher applies the fixes automatically.</w:t>
+        <w:t xml:space="preserve">Historical scale cliffs are catalogued in doc/KNOWN_ISSUES.md. The compatibility profile activates only version-pinned targeted changes and every required process attests the result before READY.</w:t>
       </w:r>
     </w:p>
     <w:tbl>
@@ -3248,7 +3134,7 @@
               <w:t xml:space="preserve">Portability.  </w:t>
             </w:r>
             <w:r>
-              <w:t xml:space="preserve">The inference engine and front-end proxy are pluggable (EXASERVE_ENGINE / proxy_config.type), but the batch scheduler is PBS-only today: the launcher reads $PBS_NODEFILE and stages over mpiexec/PALS. A SchedulerBackend interface is designed (doc/design/scheduler_abstraction.md) but not yet implemented — another scheduler currently means writing that backend (e.g. srun instead of mpiexec). Slurm is the planned first addition. Accelerator support is likewise Intel-XPU-only today, with a NVIDIA/AMD vendor abstraction designed but not built.</w:t>
+              <w:t xml:space="preserve">The code has scheduler, gateway, vendor, and engine interfaces, but interfaces are not support claims. The default Aurora SiteProfile qualifies only PBS, XPU, vLLM, and HAProxy. Slurm/PSI-J, CUDA/ROCm, SGLang, streaming, direct exposure, and alternate gateways fail closed or require explicit validation-only plans until separately proven.</w:t>
             </w:r>
           </w:p>
         </w:tc>
@@ -3350,7 +3236,7 @@
         <w:spacing w:after="80"/>
       </w:pPr>
       <w:r>
-        <w:t xml:space="preserve">There is no authentication by default; use proxy_config.type: litellm to add API keys, rate limiting, and usage tracking.</w:t>
+        <w:t xml:space="preserve">The current HAProxy exposure is trusted-allocation/internal and has no public-network authentication claim. Do not expose it outside that boundary. LiteLLM is validation-only.</w:t>
       </w:r>
     </w:p>
     <w:p>

</xml_diff>